<commit_message>
Fix deployment build error: add back deleted products.js exports
</commit_message>
<xml_diff>
--- a/Kapoor_Furnitures_Agreement_Invoice.docx
+++ b/Kapoor_Furnitures_Agreement_Invoice.docx
@@ -61,7 +61,28 @@
         <w:t xml:space="preserve">Date: </w:t>
       </w:r>
       <w:r>
-        <w:t>20 June 2026</w:t>
+        <w:t xml:space="preserve"> </w:t>
+      </w:r>
+      <w:r>
+        <w:t>29</w:t>
+      </w:r>
+      <w:r>
+        <w:rPr>
+          <w:vertAlign w:val="superscript"/>
+        </w:rPr>
+        <w:t>th</w:t>
+      </w:r>
+      <w:r>
+        <w:t xml:space="preserve"> </w:t>
+      </w:r>
+      <w:r>
+        <w:t>Ju</w:t>
+      </w:r>
+      <w:r>
+        <w:t>n</w:t>
+      </w:r>
+      <w:r>
+        <w:t>e 2026</w:t>
       </w:r>
     </w:p>
     <w:p>
@@ -164,12 +185,6 @@
         <w:gridCol w:w="4680"/>
       </w:tblGrid>
       <w:tr>
-        <w:tblPrEx>
-          <w:tblCellMar>
-            <w:top w:w="0" w:type="dxa"/>
-            <w:bottom w:w="0" w:type="dxa"/>
-          </w:tblCellMar>
-        </w:tblPrEx>
         <w:tc>
           <w:tcPr>
             <w:tcW w:w="4680" w:type="dxa"/>
@@ -221,12 +236,6 @@
         </w:tc>
       </w:tr>
       <w:tr>
-        <w:tblPrEx>
-          <w:tblCellMar>
-            <w:top w:w="0" w:type="dxa"/>
-            <w:bottom w:w="0" w:type="dxa"/>
-          </w:tblCellMar>
-        </w:tblPrEx>
         <w:tc>
           <w:tcPr>
             <w:tcW w:w="4680" w:type="dxa"/>
@@ -268,7 +277,48 @@
               <w:rPr>
                 <w:color w:val="000000"/>
               </w:rPr>
-              <w:t>₹ 7,000</w:t>
+              <w:t xml:space="preserve">₹ </w:t>
+            </w:r>
+            <w:r>
+              <w:rPr>
+                <w:color w:val="000000"/>
+              </w:rPr>
+              <w:t>10,000</w:t>
+            </w:r>
+            <w:r>
+              <w:rPr>
+                <w:color w:val="000000"/>
+              </w:rPr>
+              <w:br/>
+            </w:r>
+            <w:r>
+              <w:t>(</w:t>
+            </w:r>
+            <w:r>
+              <w:rPr>
+                <w:sz w:val="18"/>
+                <w:szCs w:val="18"/>
+              </w:rPr>
+              <w:t xml:space="preserve">charges increased due to domain </w:t>
+            </w:r>
+            <w:proofErr w:type="gramStart"/>
+            <w:r>
+              <w:rPr>
+                <w:sz w:val="18"/>
+                <w:szCs w:val="18"/>
+              </w:rPr>
+              <w:t>costing ,</w:t>
+            </w:r>
+            <w:proofErr w:type="gramEnd"/>
+            <w:r>
+              <w:rPr>
+                <w:sz w:val="18"/>
+                <w:szCs w:val="18"/>
+              </w:rPr>
+              <w:t xml:space="preserve"> image generation and number of items exceeding 100)</w:t>
+            </w:r>
+            <w:r>
+              <w:t xml:space="preserve"> </w:t>
             </w:r>
           </w:p>
         </w:tc>
@@ -309,12 +359,6 @@
         <w:gridCol w:w="4680"/>
       </w:tblGrid>
       <w:tr>
-        <w:tblPrEx>
-          <w:tblCellMar>
-            <w:top w:w="0" w:type="dxa"/>
-            <w:bottom w:w="0" w:type="dxa"/>
-          </w:tblCellMar>
-        </w:tblPrEx>
         <w:tc>
           <w:tcPr>
             <w:tcW w:w="4680" w:type="dxa"/>
@@ -366,12 +410,6 @@
         </w:tc>
       </w:tr>
       <w:tr>
-        <w:tblPrEx>
-          <w:tblCellMar>
-            <w:top w:w="0" w:type="dxa"/>
-            <w:bottom w:w="0" w:type="dxa"/>
-          </w:tblCellMar>
-        </w:tblPrEx>
         <w:tc>
           <w:tcPr>
             <w:tcW w:w="4680" w:type="dxa"/>
@@ -419,12 +457,6 @@
         </w:tc>
       </w:tr>
       <w:tr>
-        <w:tblPrEx>
-          <w:tblCellMar>
-            <w:top w:w="0" w:type="dxa"/>
-            <w:bottom w:w="0" w:type="dxa"/>
-          </w:tblCellMar>
-        </w:tblPrEx>
         <w:tc>
           <w:tcPr>
             <w:tcW w:w="4680" w:type="dxa"/>
@@ -466,7 +498,19 @@
               <w:rPr>
                 <w:color w:val="000000"/>
               </w:rPr>
-              <w:t>₹ 5,500</w:t>
+              <w:t xml:space="preserve">₹ </w:t>
+            </w:r>
+            <w:r>
+              <w:rPr>
+                <w:color w:val="000000"/>
+              </w:rPr>
+              <w:t>8</w:t>
+            </w:r>
+            <w:r>
+              <w:rPr>
+                <w:color w:val="000000"/>
+              </w:rPr>
+              <w:t>,500</w:t>
             </w:r>
           </w:p>
         </w:tc>

</xml_diff>